<commit_message>
fix a mistake in cn-cv
</commit_message>
<xml_diff>
--- a/PDFs/杨沛禹-简历-中文.docx
+++ b/PDFs/杨沛禹-简历-中文.docx
@@ -831,8 +831,6 @@
         </w:rPr>
         <w:t>GPA：8.2/10</w:t>
       </w:r>
-      <w:bookmarkStart w:id="0" w:name="_GoBack"/>
-      <w:bookmarkEnd w:id="0"/>
     </w:p>
     <w:p>
       <w:pPr>
@@ -2443,7 +2441,50 @@
             </w14:solidFill>
           </w14:textFill>
         </w:rPr>
-        <w:t>, target journal: IJRR</w:t>
+        <w:t xml:space="preserve">, </w:t>
+      </w:r>
+      <w:bookmarkStart w:id="0" w:name="_GoBack"/>
+      <w:bookmarkEnd w:id="0"/>
+      <w:r>
+        <w:rPr>
+          <w:rFonts w:hint="eastAsia" w:ascii="Times New Roman" w:hAnsi="Times New Roman" w:eastAsia="Cambria" w:cs="Times New Roman"/>
+          <w:bCs/>
+          <w:color w:val="404040" w:themeColor="text1" w:themeTint="BF"/>
+          <w:kern w:val="0"/>
+          <w:sz w:val="22"/>
+          <w:szCs w:val="24"/>
+          <w:lang w:val="en-US" w:eastAsia="zh-CN" w:bidi="ar"/>
+          <w14:textFill>
+            <w14:solidFill>
+              <w14:schemeClr w14:val="tx1">
+                <w14:lumMod w14:val="75000"/>
+                <w14:lumOff w14:val="25000"/>
+              </w14:schemeClr>
+            </w14:solidFill>
+          </w14:textFill>
+        </w:rPr>
+        <w:t>submitted to</w:t>
+      </w:r>
+      <w:r>
+        <w:rPr>
+          <w:rFonts w:hint="eastAsia" w:ascii="Times New Roman" w:hAnsi="Times New Roman" w:eastAsia="Cambria" w:cs="Times New Roman"/>
+          <w:b w:val="0"/>
+          <w:bCs/>
+          <w:color w:val="404040" w:themeColor="text1" w:themeTint="BF"/>
+          <w:kern w:val="0"/>
+          <w:sz w:val="22"/>
+          <w:szCs w:val="24"/>
+          <w:lang w:val="en-US" w:eastAsia="zh-CN" w:bidi="ar"/>
+          <w14:textFill>
+            <w14:solidFill>
+              <w14:schemeClr w14:val="tx1">
+                <w14:lumMod w14:val="75000"/>
+                <w14:lumOff w14:val="25000"/>
+              </w14:schemeClr>
+            </w14:solidFill>
+          </w14:textFill>
+        </w:rPr>
+        <w:t xml:space="preserve"> IJRR</w:t>
       </w:r>
     </w:p>
     <w:p>
@@ -2631,6 +2672,7 @@
     <w:p>
       <w:pPr>
         <w:numPr>
+          <w:ilvl w:val="0"/>
           <w:numId w:val="0"/>
         </w:numPr>
         <w:ind w:leftChars="0"/>

</xml_diff>